<commit_message>
Lampiran A: jangan pra-tandakan kotak Perakuan Ketua Jabatan.
Biarkan Tuan PPD / Ketua Jabatan tandakan sendiri sama ada pegawai perlu tuntutan kenderaan.

Co-authored-by: Cursor <cursoragent@cursor.com>
</commit_message>
<xml_diff>
--- a/egerak-v2/docs/Lampiran-A_1780479522.docx
+++ b/egerak-v2/docs/Lampiran-A_1780479522.docx
@@ -1541,9 +1541,6 @@
                                     <w:ind w:left="0"/>
                                     <w:jc w:val="center"/>
                                   </w:pPr>
-                                  <w:r>
-                                    <w:sym w:font="Wingdings" w:char="F0FC"/>
-                                  </w:r>
                                 </w:p>
                               </w:txbxContent>
                             </wps:txbx>
@@ -1569,9 +1566,6 @@
                               <w:ind w:left="0"/>
                               <w:jc w:val="center"/>
                             </w:pPr>
-                            <w:r>
-                              <w:sym w:font="Wingdings" w:char="F0FC"/>
-                            </w:r>
                           </w:p>
                         </w:txbxContent>
                       </v:textbox>

</xml_diff>